<commit_message>
Update Word document, add temp file
Modify Florian/Document complémentair1.docx (binary .docx changed) and add Florian/~WRL1835.tmp (new Word temporary file). The ~WRL...tmp file appears to be an auto-generated temp file and could be removed or added to .gitignore.
</commit_message>
<xml_diff>
--- a/Florian/Document complémentair1.docx
+++ b/Florian/Document complémentair1.docx
@@ -88,13 +88,7 @@
     </w:p>
     <w:p>
       <w:r>
-        <w:t>Nous avons eu un premier encadrement concernant les infrastructures, notamment les éoliennes, les panneaux photovoltaïques et le parc de batteries, dont nous avions précédemment fait la connaissance. Nous avons également pris des photos de ces installations</w:t>
-      </w:r>
-      <w:r>
-        <w:t>. Il y a aussi</w:t>
-      </w:r>
-      <w:r>
-        <w:t xml:space="preserve"> des éléments réels comme le Raspberry Pi 5 et le RCC-02.</w:t>
+        <w:t>Nous avons eu un premier encadrement concernant les infrastructures, notamment les éoliennes, les panneaux photovoltaïques et le parc de batteries, dont nous avions précédemment fait la connaissance. Nous avons également pris des photos de ces installations. Il y a aussi des éléments réels comme le Raspberry Pi 5 et le RCC-02.</w:t>
       </w:r>
     </w:p>
     <w:p>
@@ -145,33 +139,7 @@
     <w:p>
       <w:r>
         <w:lastRenderedPageBreak/>
-        <w:t xml:space="preserve">J’ai également eu l'opportunité de simuler le réseau du projet </w:t>
-      </w:r>
-      <w:proofErr w:type="spellStart"/>
-      <w:r>
-        <w:t>InfoProd</w:t>
-      </w:r>
-      <w:proofErr w:type="spellEnd"/>
-      <w:r>
-        <w:t xml:space="preserve">, ce qui nous permet de modéliser le réseau sans avoir besoin d'utiliser le matériel </w:t>
-      </w:r>
-      <w:proofErr w:type="spellStart"/>
-      <w:proofErr w:type="gramStart"/>
-      <w:r>
-        <w:t>physique.J’ai</w:t>
-      </w:r>
-      <w:proofErr w:type="spellEnd"/>
-      <w:proofErr w:type="gramEnd"/>
-      <w:r>
-        <w:t xml:space="preserve"> également eu l'opportunité de simuler le réseau du projet </w:t>
-      </w:r>
-      <w:proofErr w:type="spellStart"/>
-      <w:r>
-        <w:t>InfoProd</w:t>
-      </w:r>
-      <w:proofErr w:type="spellEnd"/>
-      <w:r>
-        <w:t>, ce qui nous permet de modéliser le réseau sans avoir besoin d'utiliser le matériel physique.</w:t>
+        <w:t>J’ai également eu l'opportunité de simuler le réseau du projet InfoProd, ce qui nous permet de modéliser le réseau sans avoir besoin d'utiliser le matériel physique.J’ai également eu l'opportunité de simuler le réseau du projet InfoProd, ce qui nous permet de modéliser le réseau sans avoir besoin d'utiliser le matériel physique.</w:t>
       </w:r>
     </w:p>
     <w:p/>
@@ -187,68 +155,191 @@
           <w:b/>
           <w:bCs/>
         </w:rPr>
-        <w:t xml:space="preserve">Diagramme 5 </w:t>
-      </w:r>
-      <w:proofErr w:type="spellStart"/>
-      <w:r>
-        <w:rPr>
-          <w:b/>
-          <w:bCs/>
-        </w:rPr>
-        <w:t>Github</w:t>
-      </w:r>
-      <w:proofErr w:type="spellEnd"/>
-      <w:r>
-        <w:rPr>
-          <w:b/>
-          <w:bCs/>
-        </w:rPr>
+        <w:t xml:space="preserve">Diagramme 5 Github </w:t>
+      </w:r>
+    </w:p>
+    <w:p>
+      <w:pPr>
+        <w:rPr>
+          <w:rStyle w:val="agcmg"/>
+        </w:rPr>
+      </w:pPr>
+      <w:r>
+        <w:rPr>
+          <w:rStyle w:val="agcmg"/>
+        </w:rPr>
+        <w:t>J’ai également mis en place, avec l’aide de camarades d’un autre groupe, un logiciel de versionnement. Cela m’a beaucoup aidé car c’est plus facile de partager des fichiers avec le reste du groupe d’InfoProd.</w:t>
+      </w:r>
+    </w:p>
+    <w:p>
+      <w:pPr>
+        <w:rPr>
+          <w:rStyle w:val="agcmg"/>
+        </w:rPr>
+      </w:pPr>
+    </w:p>
+    <w:p>
+      <w:pPr>
+        <w:rPr>
+          <w:rStyle w:val="agcmg"/>
+        </w:rPr>
+      </w:pPr>
+    </w:p>
+    <w:p>
+      <w:pPr>
+        <w:rPr>
+          <w:rStyle w:val="agcmg"/>
+          <w:color w:val="FF0000"/>
+        </w:rPr>
+      </w:pPr>
+      <w:r>
+        <w:rPr>
+          <w:rStyle w:val="agcmg"/>
+          <w:color w:val="FF0000"/>
+        </w:rPr>
+        <w:t>Partie personnelle</w:t>
+      </w:r>
+    </w:p>
+    <w:p>
+      <w:pPr>
+        <w:rPr>
+          <w:rStyle w:val="agcmg"/>
+          <w:b/>
+          <w:bCs/>
+        </w:rPr>
+      </w:pPr>
+      <w:r>
+        <w:rPr>
+          <w:rStyle w:val="agcmg"/>
+          <w:b/>
+          <w:bCs/>
+        </w:rPr>
+        <w:t>Diapositive 1</w:t>
+      </w:r>
+      <w:r>
+        <w:rPr>
+          <w:rStyle w:val="agcmg"/>
+          <w:b/>
+          <w:bCs/>
+        </w:rPr>
+        <w:t xml:space="preserve"> Introduction </w:t>
+      </w:r>
+    </w:p>
+    <w:p>
+      <w:pPr>
+        <w:rPr>
+          <w:rStyle w:val="agcmg"/>
+        </w:rPr>
+      </w:pPr>
+      <w:r>
+        <w:rPr>
+          <w:rStyle w:val="agcmg"/>
+        </w:rPr>
+        <w:t>Tout comme pour la partie commune, nous devions apporter des corrections à certains diagrammes, notamment le diagramme de cas d'utilisation de déploiement. J'ai également réalisé un diagramme de séquence.</w:t>
+      </w:r>
+    </w:p>
+    <w:p>
+      <w:pPr>
+        <w:rPr>
+          <w:rStyle w:val="agcmg"/>
+          <w:b/>
+          <w:bCs/>
+        </w:rPr>
+      </w:pPr>
+      <w:r>
+        <w:rPr>
+          <w:rStyle w:val="agcmg"/>
+          <w:b/>
+          <w:bCs/>
+        </w:rPr>
+        <w:t xml:space="preserve">Diapositive 3 </w:t>
+      </w:r>
+    </w:p>
+    <w:p>
+      <w:pPr>
+        <w:rPr>
+          <w:sz w:val="24"/>
+        </w:rPr>
+      </w:pPr>
+      <w:r>
+        <w:t>Voici une explication simple que tu peux mettre dans ton rapport :</w:t>
+      </w:r>
+    </w:p>
+    <w:p>
+      <w:r>
+        <w:t>Dans ce diagramme de déploiement, on voit d’abord l’</w:t>
+      </w:r>
+      <w:r>
+        <w:rPr>
+          <w:rStyle w:val="lev"/>
+          <w:rFonts w:ascii="Georgia" w:hAnsi="Georgia"/>
+          <w:spacing w:val="1"/>
+          <w:bdr w:val="single" w:sz="2" w:space="0" w:color="auto" w:frame="1"/>
+        </w:rPr>
+        <w:t>administrateur</w:t>
+      </w:r>
+      <w:r>
+        <w:t xml:space="preserve"> qui utilise un poste administrateur/secrétariat équipé d’un navigateur web pour accéder à l’application InfoProd. Le navigateur se connecte en </w:t>
+      </w:r>
+      <w:r>
+        <w:lastRenderedPageBreak/>
+        <w:t>HTTPS au serveur InfoProd, qui héberge le serveur web, l’application serveur de gabarits et la base de données. Enfin, le Raspberry Pi, connecté au serveur InfoProd via</w:t>
+      </w:r>
+      <w:r>
         <w:t xml:space="preserve"> </w:t>
       </w:r>
-    </w:p>
-    <w:p>
-      <w:pPr>
-        <w:rPr>
-          <w:b/>
-          <w:bCs/>
-        </w:rPr>
-      </w:pPr>
-      <w:r>
-        <w:rPr>
-          <w:rStyle w:val="agcmg"/>
-        </w:rPr>
-        <w:t xml:space="preserve">J’ai également mis en place, avec l’aide de camarades d’un autre groupe, un logiciel de </w:t>
-      </w:r>
-      <w:proofErr w:type="spellStart"/>
-      <w:r>
-        <w:rPr>
-          <w:rStyle w:val="agcmg"/>
-        </w:rPr>
-        <w:t>versionnement</w:t>
-      </w:r>
-      <w:proofErr w:type="spellEnd"/>
-      <w:r>
-        <w:rPr>
-          <w:rStyle w:val="agcmg"/>
-        </w:rPr>
-        <w:t>. Cela m’a beaucoup aidé car c’est plus facile de partager des fichiers avec le reste du groupe d’</w:t>
-      </w:r>
-      <w:proofErr w:type="spellStart"/>
-      <w:r>
-        <w:rPr>
-          <w:rStyle w:val="agcmg"/>
-        </w:rPr>
-        <w:t>InfoProd</w:t>
-      </w:r>
-      <w:proofErr w:type="spellEnd"/>
-      <w:r>
-        <w:rPr>
-          <w:rStyle w:val="agcmg"/>
-        </w:rPr>
-        <w:t>.</w:t>
-      </w:r>
-    </w:p>
-    <w:p/>
+      <w:r>
+        <w:t xml:space="preserve"> le réseau local (LAN), exécute l’application d’affichage et envoie les gabarits vers l’écran d’affichage.</w:t>
+      </w:r>
+    </w:p>
+    <w:p>
+      <w:r>
+        <w:t xml:space="preserve">   </w:t>
+      </w:r>
+    </w:p>
+    <w:p>
+      <w:pPr>
+        <w:jc w:val="both"/>
+        <w:rPr>
+          <w:rStyle w:val="agcmg"/>
+          <w:b/>
+          <w:bCs/>
+        </w:rPr>
+      </w:pPr>
+      <w:r>
+        <w:rPr>
+          <w:rStyle w:val="agcmg"/>
+          <w:b/>
+          <w:bCs/>
+        </w:rPr>
+        <w:t xml:space="preserve">Diapositive 4 </w:t>
+      </w:r>
+    </w:p>
+    <w:p>
+      <w:r>
+        <w:t>Ce diagramme de séquence décrit le scénario « Gérer les gabarits » pour l’administrateur système. L’administrateur ouvre d’abord la page de gestion des gabarits dans le navigateur web, qui envoie une requête GET au contrôleur PHP. Le contrôleur interroge la base de données MySQL avec une requête SELECT et renvoie au navigateur la liste des gabarits à afficher (phase de consultation). Ensuite, lorsque l’administrateur modifie un gabarit, le navigateur envoie une requête POST au contrôleur avec les nouvelles données, qui exécute une requête UPDATE sur la base de données. La base confirme la mise à jour et le contrôleur renvoie au navigateur un message de confirmation « Gabarit mis à jour » accompagné de la liste actualisée. L’authentification de l’utilisateur est incluse avant chaque action importante, comme indiqué par la note « include ».</w:t>
+      </w:r>
+    </w:p>
+    <w:p>
+      <w:pPr>
+        <w:rPr>
+          <w:rStyle w:val="agcmg"/>
+          <w:b/>
+          <w:bCs/>
+        </w:rPr>
+      </w:pPr>
+      <w:r>
+        <w:t>Diapositive 5</w:t>
+      </w:r>
+    </w:p>
+    <w:p>
+      <w:pPr>
+        <w:rPr>
+          <w:b/>
+          <w:bCs/>
+        </w:rPr>
+      </w:pPr>
+    </w:p>
     <w:sectPr>
       <w:pgSz w:w="11906" w:h="16838"/>
       <w:pgMar w:top="1417" w:right="1417" w:bottom="1417" w:left="1417" w:header="708" w:footer="708" w:gutter="0"/>
@@ -665,7 +756,6 @@
   <w:style w:type="character" w:default="1" w:styleId="Policepardfaut">
     <w:name w:val="Default Paragraph Font"/>
     <w:uiPriority w:val="1"/>
-    <w:semiHidden/>
     <w:unhideWhenUsed/>
   </w:style>
   <w:style w:type="table" w:default="1" w:styleId="TableauNormal">
@@ -758,6 +848,31 @@
       <w:sz w:val="24"/>
       <w:szCs w:val="24"/>
       <w:lang w:eastAsia="fr-FR"/>
+    </w:rPr>
+  </w:style>
+  <w:style w:type="paragraph" w:customStyle="1" w:styleId="my-2">
+    <w:name w:val="my-2"/>
+    <w:basedOn w:val="Normal"/>
+    <w:rsid w:val="00942F74"/>
+    <w:pPr>
+      <w:spacing w:before="100" w:beforeAutospacing="1" w:after="100" w:afterAutospacing="1" w:line="240" w:lineRule="auto"/>
+    </w:pPr>
+    <w:rPr>
+      <w:rFonts w:ascii="Times New Roman" w:eastAsia="Times New Roman" w:hAnsi="Times New Roman" w:cs="Times New Roman"/>
+      <w:sz w:val="24"/>
+      <w:szCs w:val="24"/>
+      <w:lang w:eastAsia="fr-FR"/>
+    </w:rPr>
+  </w:style>
+  <w:style w:type="character" w:styleId="lev">
+    <w:name w:val="Strong"/>
+    <w:basedOn w:val="Policepardfaut"/>
+    <w:uiPriority w:val="22"/>
+    <w:qFormat/>
+    <w:rsid w:val="00942F74"/>
+    <w:rPr>
+      <w:b/>
+      <w:bCs/>
     </w:rPr>
   </w:style>
 </w:styles>

</xml_diff>

<commit_message>
Add personal slides; update doc; remove temps
Add personal slide deck files (Florian/Partie perso.pptx and Partie perso.pptx.ppsx). Update binary document Florian/Document complémentair1.docx. Clean up deleted files: remove Office temp files (~$... and ~WRL1835.tmp) and delete partie commune/Partie commune.pptx to remove the shared presentation.
</commit_message>
<xml_diff>
--- a/Florian/Document complémentair1.docx
+++ b/Florian/Document complémentair1.docx
@@ -139,7 +139,33 @@
     <w:p>
       <w:r>
         <w:lastRenderedPageBreak/>
-        <w:t>J’ai également eu l'opportunité de simuler le réseau du projet InfoProd, ce qui nous permet de modéliser le réseau sans avoir besoin d'utiliser le matériel physique.J’ai également eu l'opportunité de simuler le réseau du projet InfoProd, ce qui nous permet de modéliser le réseau sans avoir besoin d'utiliser le matériel physique.</w:t>
+        <w:t xml:space="preserve">J’ai également eu l'opportunité de simuler le réseau du projet </w:t>
+      </w:r>
+      <w:proofErr w:type="spellStart"/>
+      <w:r>
+        <w:t>InfoProd</w:t>
+      </w:r>
+      <w:proofErr w:type="spellEnd"/>
+      <w:r>
+        <w:t xml:space="preserve">, ce qui nous permet de modéliser le réseau sans avoir besoin d'utiliser le matériel </w:t>
+      </w:r>
+      <w:proofErr w:type="spellStart"/>
+      <w:proofErr w:type="gramStart"/>
+      <w:r>
+        <w:t>physique.J’ai</w:t>
+      </w:r>
+      <w:proofErr w:type="spellEnd"/>
+      <w:proofErr w:type="gramEnd"/>
+      <w:r>
+        <w:t xml:space="preserve"> également eu l'opportunité de simuler le réseau du projet </w:t>
+      </w:r>
+      <w:proofErr w:type="spellStart"/>
+      <w:r>
+        <w:t>InfoProd</w:t>
+      </w:r>
+      <w:proofErr w:type="spellEnd"/>
+      <w:r>
+        <w:t>, ce qui nous permet de modéliser le réseau sans avoir besoin d'utiliser le matériel physique.</w:t>
       </w:r>
     </w:p>
     <w:p/>
@@ -155,20 +181,64 @@
           <w:b/>
           <w:bCs/>
         </w:rPr>
-        <w:t xml:space="preserve">Diagramme 5 Github </w:t>
-      </w:r>
-    </w:p>
-    <w:p>
-      <w:pPr>
-        <w:rPr>
-          <w:rStyle w:val="agcmg"/>
-        </w:rPr>
-      </w:pPr>
-      <w:r>
-        <w:rPr>
-          <w:rStyle w:val="agcmg"/>
-        </w:rPr>
-        <w:t>J’ai également mis en place, avec l’aide de camarades d’un autre groupe, un logiciel de versionnement. Cela m’a beaucoup aidé car c’est plus facile de partager des fichiers avec le reste du groupe d’InfoProd.</w:t>
+        <w:t xml:space="preserve">Diagramme 5 </w:t>
+      </w:r>
+      <w:proofErr w:type="spellStart"/>
+      <w:r>
+        <w:rPr>
+          <w:b/>
+          <w:bCs/>
+        </w:rPr>
+        <w:t>Github</w:t>
+      </w:r>
+      <w:proofErr w:type="spellEnd"/>
+      <w:r>
+        <w:rPr>
+          <w:b/>
+          <w:bCs/>
+        </w:rPr>
+        <w:t xml:space="preserve"> </w:t>
+      </w:r>
+    </w:p>
+    <w:p>
+      <w:pPr>
+        <w:rPr>
+          <w:rStyle w:val="agcmg"/>
+        </w:rPr>
+      </w:pPr>
+      <w:r>
+        <w:rPr>
+          <w:rStyle w:val="agcmg"/>
+        </w:rPr>
+        <w:t xml:space="preserve">J’ai également mis en place, avec l’aide de camarades d’un autre groupe, un logiciel de </w:t>
+      </w:r>
+      <w:proofErr w:type="spellStart"/>
+      <w:r>
+        <w:rPr>
+          <w:rStyle w:val="agcmg"/>
+        </w:rPr>
+        <w:t>versionnement</w:t>
+      </w:r>
+      <w:proofErr w:type="spellEnd"/>
+      <w:r>
+        <w:rPr>
+          <w:rStyle w:val="agcmg"/>
+        </w:rPr>
+        <w:t>. Cela m’a beaucoup aidé car c’est plus facile de partager des fichiers avec le reste du groupe d’</w:t>
+      </w:r>
+      <w:proofErr w:type="spellStart"/>
+      <w:r>
+        <w:rPr>
+          <w:rStyle w:val="agcmg"/>
+        </w:rPr>
+        <w:t>InfoProd</w:t>
+      </w:r>
+      <w:proofErr w:type="spellEnd"/>
+      <w:r>
+        <w:rPr>
+          <w:rStyle w:val="agcmg"/>
+        </w:rPr>
+        <w:t>.</w:t>
       </w:r>
     </w:p>
     <w:p>
@@ -279,17 +349,49 @@
         <w:t>administrateur</w:t>
       </w:r>
       <w:r>
-        <w:t xml:space="preserve"> qui utilise un poste administrateur/secrétariat équipé d’un navigateur web pour accéder à l’application InfoProd. Le navigateur se connecte en </w:t>
+        <w:t xml:space="preserve"> qui utilise un poste administrateur/secrétariat équipé d’un navigateur web pour accéder à l’application </w:t>
+      </w:r>
+      <w:proofErr w:type="spellStart"/>
+      <w:r>
+        <w:t>InfoProd</w:t>
+      </w:r>
+      <w:proofErr w:type="spellEnd"/>
+      <w:r>
+        <w:t xml:space="preserve">. Le navigateur se connecte en </w:t>
       </w:r>
       <w:r>
         <w:lastRenderedPageBreak/>
-        <w:t>HTTPS au serveur InfoProd, qui héberge le serveur web, l’application serveur de gabarits et la base de données. Enfin, le Raspberry Pi, connecté au serveur InfoProd via</w:t>
-      </w:r>
+        <w:t xml:space="preserve">HTTPS au serveur </w:t>
+      </w:r>
+      <w:proofErr w:type="spellStart"/>
+      <w:r>
+        <w:t>InfoProd</w:t>
+      </w:r>
+      <w:proofErr w:type="spellEnd"/>
+      <w:r>
+        <w:t xml:space="preserve">, qui héberge le serveur web, l’application serveur de gabarits et la base de données. Enfin, le Raspberry Pi, connecté au serveur </w:t>
+      </w:r>
+      <w:proofErr w:type="spellStart"/>
+      <w:r>
+        <w:t>InfoProd</w:t>
+      </w:r>
+      <w:proofErr w:type="spellEnd"/>
       <w:r>
         <w:t xml:space="preserve"> </w:t>
       </w:r>
-      <w:r>
-        <w:t xml:space="preserve"> le réseau local (LAN), exécute l’application d’affichage et envoie les gabarits vers l’écran d’affichage.</w:t>
+      <w:proofErr w:type="gramStart"/>
+      <w:r>
+        <w:t>via</w:t>
+      </w:r>
+      <w:r>
+        <w:t xml:space="preserve"> </w:t>
+      </w:r>
+      <w:r>
+        <w:t xml:space="preserve"> le</w:t>
+      </w:r>
+      <w:proofErr w:type="gramEnd"/>
+      <w:r>
+        <w:t xml:space="preserve"> réseau local (LAN), exécute l’application d’affichage et envoie les gabarits vers l’écran d’affichage.</w:t>
       </w:r>
     </w:p>
     <w:p>
@@ -317,20 +419,114 @@
     </w:p>
     <w:p>
       <w:r>
-        <w:t>Ce diagramme de séquence décrit le scénario « Gérer les gabarits » pour l’administrateur système. L’administrateur ouvre d’abord la page de gestion des gabarits dans le navigateur web, qui envoie une requête GET au contrôleur PHP. Le contrôleur interroge la base de données MySQL avec une requête SELECT et renvoie au navigateur la liste des gabarits à afficher (phase de consultation). Ensuite, lorsque l’administrateur modifie un gabarit, le navigateur envoie une requête POST au contrôleur avec les nouvelles données, qui exécute une requête UPDATE sur la base de données. La base confirme la mise à jour et le contrôleur renvoie au navigateur un message de confirmation « Gabarit mis à jour » accompagné de la liste actualisée. L’authentification de l’utilisateur est incluse avant chaque action importante, comme indiqué par la note « include ».</w:t>
-      </w:r>
-    </w:p>
-    <w:p>
-      <w:pPr>
-        <w:rPr>
-          <w:rStyle w:val="agcmg"/>
-          <w:b/>
-          <w:bCs/>
-        </w:rPr>
-      </w:pPr>
-      <w:r>
+        <w:t xml:space="preserve">Ce diagramme de séquence décrit le scénario « Gérer les gabarits » pour l’administrateur système. L’administrateur ouvre d’abord la page de gestion des gabarits dans le navigateur web, qui envoie une requête GET au contrôleur PHP. Le contrôleur interroge la base de données MySQL avec une requête SELECT et renvoie au navigateur la liste des gabarits à afficher (phase de consultation). Ensuite, lorsque l’administrateur modifie un gabarit, le navigateur envoie une requête POST au contrôleur avec les nouvelles données, qui exécute une requête UPDATE sur la base de données. La base confirme la mise à jour et le contrôleur renvoie au navigateur un message de confirmation « Gabarit mis à jour » accompagné de la liste actualisée. L’authentification de l’utilisateur est incluse avant chaque action importante, comme indiqué par la note « </w:t>
+      </w:r>
+      <w:proofErr w:type="spellStart"/>
+      <w:r>
+        <w:t>include</w:t>
+      </w:r>
+      <w:proofErr w:type="spellEnd"/>
+      <w:r>
+        <w:t xml:space="preserve"> ».</w:t>
+      </w:r>
+    </w:p>
+    <w:p>
+      <w:pPr>
+        <w:rPr>
+          <w:rStyle w:val="agcmg"/>
+          <w:b/>
+          <w:bCs/>
+        </w:rPr>
+      </w:pPr>
+      <w:r>
+        <w:rPr>
+          <w:b/>
+          <w:bCs/>
+        </w:rPr>
         <w:t>Diapositive 5</w:t>
       </w:r>
+      <w:r>
+        <w:rPr>
+          <w:b/>
+          <w:bCs/>
+        </w:rPr>
+        <w:t xml:space="preserve"> Diagramme de classe </w:t>
+      </w:r>
+    </w:p>
+    <w:p>
+      <w:pPr>
+        <w:rPr>
+          <w:lang w:eastAsia="fr-FR"/>
+        </w:rPr>
+      </w:pPr>
+      <w:r>
+        <w:rPr>
+          <w:b/>
+          <w:bCs/>
+          <w:bdr w:val="single" w:sz="2" w:space="0" w:color="auto" w:frame="1"/>
+          <w:lang w:eastAsia="fr-FR"/>
+        </w:rPr>
+        <w:t>Relations</w:t>
+      </w:r>
+      <w:r>
+        <w:rPr>
+          <w:lang w:eastAsia="fr-FR"/>
+        </w:rPr>
+        <w:t xml:space="preserve"> : Un utilisateur gère les gabarits </w:t>
+      </w:r>
+      <w:r>
+        <w:rPr>
+          <w:rFonts w:ascii="Times New Roman" w:hAnsi="Times New Roman"/>
+          <w:lang w:eastAsia="fr-FR"/>
+        </w:rPr>
+        <w:t>→</w:t>
+      </w:r>
+      <w:r>
+        <w:rPr>
+          <w:lang w:eastAsia="fr-FR"/>
+        </w:rPr>
+        <w:t xml:space="preserve"> les gabarits contiennent des contenus </w:t>
+      </w:r>
+      <w:r>
+        <w:rPr>
+          <w:rFonts w:ascii="Times New Roman" w:hAnsi="Times New Roman"/>
+          <w:lang w:eastAsia="fr-FR"/>
+        </w:rPr>
+        <w:t>→</w:t>
+      </w:r>
+      <w:r>
+        <w:rPr>
+          <w:lang w:eastAsia="fr-FR"/>
+        </w:rPr>
+        <w:t xml:space="preserve"> envoy</w:t>
+      </w:r>
+      <w:r>
+        <w:rPr>
+          <w:rFonts w:cs="Georgia"/>
+          <w:lang w:eastAsia="fr-FR"/>
+        </w:rPr>
+        <w:t>é</w:t>
+      </w:r>
+      <w:r>
+        <w:rPr>
+          <w:lang w:eastAsia="fr-FR"/>
+        </w:rPr>
+        <w:t>s vers Raspberry Pi.</w:t>
+      </w:r>
+    </w:p>
+    <w:p>
+      <w:pPr>
+        <w:rPr>
+          <w:lang w:eastAsia="fr-FR"/>
+        </w:rPr>
+      </w:pPr>
+    </w:p>
+    <w:p>
+      <w:pPr>
+        <w:rPr>
+          <w:lang w:eastAsia="fr-FR"/>
+        </w:rPr>
+      </w:pPr>
     </w:p>
     <w:p>
       <w:pPr>
@@ -348,6 +544,163 @@
     </w:sectPr>
   </w:body>
 </w:document>
+</file>
+
+<file path=word/numbering.xml><?xml version="1.0" encoding="utf-8"?>
+<w:numbering xmlns:wpc="http://schemas.microsoft.com/office/word/2010/wordprocessingCanvas" xmlns:cx="http://schemas.microsoft.com/office/drawing/2014/chartex" xmlns:cx1="http://schemas.microsoft.com/office/drawing/2015/9/8/chartex" xmlns:cx2="http://schemas.microsoft.com/office/drawing/2015/10/21/chartex" xmlns:cx3="http://schemas.microsoft.com/office/drawing/2016/5/9/chartex" xmlns:cx4="http://schemas.microsoft.com/office/drawing/2016/5/10/chartex" xmlns:cx5="http://schemas.microsoft.com/office/drawing/2016/5/11/chartex" xmlns:cx6="http://schemas.microsoft.com/office/drawing/2016/5/12/chartex" xmlns:cx7="http://schemas.microsoft.com/office/drawing/2016/5/13/chartex" xmlns:cx8="http://schemas.microsoft.com/office/drawing/2016/5/14/chartex" xmlns:mc="http://schemas.openxmlformats.org/markup-compatibility/2006" xmlns:aink="http://schemas.microsoft.com/office/drawing/2016/ink" xmlns:am3d="http://schemas.microsoft.com/office/drawing/2017/model3d" xmlns:o="urn:schemas-microsoft-com:office:office" xmlns:r="http://schemas.openxmlformats.org/officeDocument/2006/relationships" xmlns:m="http://schemas.openxmlformats.org/officeDocument/2006/math" xmlns:v="urn:schemas-microsoft-com:vml" xmlns:wp14="http://schemas.microsoft.com/office/word/2010/wordprocessingDrawing" xmlns:wp="http://schemas.openxmlformats.org/drawingml/2006/wordprocessingDrawing" xmlns:w10="urn:schemas-microsoft-com:office:word" xmlns:w="http://schemas.openxmlformats.org/wordprocessingml/2006/main" xmlns:w14="http://schemas.microsoft.com/office/word/2010/wordml" xmlns:w15="http://schemas.microsoft.com/office/word/2012/wordml" xmlns:w16cex="http://schemas.microsoft.com/office/word/2018/wordml/cex" xmlns:w16cid="http://schemas.microsoft.com/office/word/2016/wordml/cid" xmlns:w16="http://schemas.microsoft.com/office/word/2018/wordml" xmlns:w16sdtdh="http://schemas.microsoft.com/office/word/2020/wordml/sdtdatahash" xmlns:w16se="http://schemas.microsoft.com/office/word/2015/wordml/symex" xmlns:wpg="http://schemas.microsoft.com/office/word/2010/wordprocessingGroup" xmlns:wpi="http://schemas.microsoft.com/office/word/2010/wordprocessingInk" xmlns:wne="http://schemas.microsoft.com/office/word/2006/wordml" xmlns:wps="http://schemas.microsoft.com/office/word/2010/wordprocessingShape" mc:Ignorable="w14 w15 w16se w16cid w16 w16cex w16sdtdh wp14">
+  <w:abstractNum w:abstractNumId="0" w15:restartNumberingAfterBreak="0">
+    <w:nsid w:val="3003182C"/>
+    <w:multiLevelType w:val="multilevel"/>
+    <w:tmpl w:val="14CAD60C"/>
+    <w:lvl w:ilvl="0">
+      <w:start w:val="1"/>
+      <w:numFmt w:val="bullet"/>
+      <w:lvlText w:val=""/>
+      <w:lvlJc w:val="left"/>
+      <w:pPr>
+        <w:tabs>
+          <w:tab w:val="num" w:pos="720"/>
+        </w:tabs>
+        <w:ind w:left="720" w:hanging="360"/>
+      </w:pPr>
+      <w:rPr>
+        <w:rFonts w:ascii="Symbol" w:hAnsi="Symbol" w:hint="default"/>
+        <w:sz w:val="20"/>
+      </w:rPr>
+    </w:lvl>
+    <w:lvl w:ilvl="1" w:tentative="1">
+      <w:start w:val="1"/>
+      <w:numFmt w:val="bullet"/>
+      <w:lvlText w:val=""/>
+      <w:lvlJc w:val="left"/>
+      <w:pPr>
+        <w:tabs>
+          <w:tab w:val="num" w:pos="1440"/>
+        </w:tabs>
+        <w:ind w:left="1440" w:hanging="360"/>
+      </w:pPr>
+      <w:rPr>
+        <w:rFonts w:ascii="Symbol" w:hAnsi="Symbol" w:hint="default"/>
+        <w:sz w:val="20"/>
+      </w:rPr>
+    </w:lvl>
+    <w:lvl w:ilvl="2" w:tentative="1">
+      <w:start w:val="1"/>
+      <w:numFmt w:val="bullet"/>
+      <w:lvlText w:val=""/>
+      <w:lvlJc w:val="left"/>
+      <w:pPr>
+        <w:tabs>
+          <w:tab w:val="num" w:pos="2160"/>
+        </w:tabs>
+        <w:ind w:left="2160" w:hanging="360"/>
+      </w:pPr>
+      <w:rPr>
+        <w:rFonts w:ascii="Symbol" w:hAnsi="Symbol" w:hint="default"/>
+        <w:sz w:val="20"/>
+      </w:rPr>
+    </w:lvl>
+    <w:lvl w:ilvl="3" w:tentative="1">
+      <w:start w:val="1"/>
+      <w:numFmt w:val="bullet"/>
+      <w:lvlText w:val=""/>
+      <w:lvlJc w:val="left"/>
+      <w:pPr>
+        <w:tabs>
+          <w:tab w:val="num" w:pos="2880"/>
+        </w:tabs>
+        <w:ind w:left="2880" w:hanging="360"/>
+      </w:pPr>
+      <w:rPr>
+        <w:rFonts w:ascii="Symbol" w:hAnsi="Symbol" w:hint="default"/>
+        <w:sz w:val="20"/>
+      </w:rPr>
+    </w:lvl>
+    <w:lvl w:ilvl="4" w:tentative="1">
+      <w:start w:val="1"/>
+      <w:numFmt w:val="bullet"/>
+      <w:lvlText w:val=""/>
+      <w:lvlJc w:val="left"/>
+      <w:pPr>
+        <w:tabs>
+          <w:tab w:val="num" w:pos="3600"/>
+        </w:tabs>
+        <w:ind w:left="3600" w:hanging="360"/>
+      </w:pPr>
+      <w:rPr>
+        <w:rFonts w:ascii="Symbol" w:hAnsi="Symbol" w:hint="default"/>
+        <w:sz w:val="20"/>
+      </w:rPr>
+    </w:lvl>
+    <w:lvl w:ilvl="5" w:tentative="1">
+      <w:start w:val="1"/>
+      <w:numFmt w:val="bullet"/>
+      <w:lvlText w:val=""/>
+      <w:lvlJc w:val="left"/>
+      <w:pPr>
+        <w:tabs>
+          <w:tab w:val="num" w:pos="4320"/>
+        </w:tabs>
+        <w:ind w:left="4320" w:hanging="360"/>
+      </w:pPr>
+      <w:rPr>
+        <w:rFonts w:ascii="Symbol" w:hAnsi="Symbol" w:hint="default"/>
+        <w:sz w:val="20"/>
+      </w:rPr>
+    </w:lvl>
+    <w:lvl w:ilvl="6" w:tentative="1">
+      <w:start w:val="1"/>
+      <w:numFmt w:val="bullet"/>
+      <w:lvlText w:val=""/>
+      <w:lvlJc w:val="left"/>
+      <w:pPr>
+        <w:tabs>
+          <w:tab w:val="num" w:pos="5040"/>
+        </w:tabs>
+        <w:ind w:left="5040" w:hanging="360"/>
+      </w:pPr>
+      <w:rPr>
+        <w:rFonts w:ascii="Symbol" w:hAnsi="Symbol" w:hint="default"/>
+        <w:sz w:val="20"/>
+      </w:rPr>
+    </w:lvl>
+    <w:lvl w:ilvl="7" w:tentative="1">
+      <w:start w:val="1"/>
+      <w:numFmt w:val="bullet"/>
+      <w:lvlText w:val=""/>
+      <w:lvlJc w:val="left"/>
+      <w:pPr>
+        <w:tabs>
+          <w:tab w:val="num" w:pos="5760"/>
+        </w:tabs>
+        <w:ind w:left="5760" w:hanging="360"/>
+      </w:pPr>
+      <w:rPr>
+        <w:rFonts w:ascii="Symbol" w:hAnsi="Symbol" w:hint="default"/>
+        <w:sz w:val="20"/>
+      </w:rPr>
+    </w:lvl>
+    <w:lvl w:ilvl="8" w:tentative="1">
+      <w:start w:val="1"/>
+      <w:numFmt w:val="bullet"/>
+      <w:lvlText w:val=""/>
+      <w:lvlJc w:val="left"/>
+      <w:pPr>
+        <w:tabs>
+          <w:tab w:val="num" w:pos="6480"/>
+        </w:tabs>
+        <w:ind w:left="6480" w:hanging="360"/>
+      </w:pPr>
+      <w:rPr>
+        <w:rFonts w:ascii="Symbol" w:hAnsi="Symbol" w:hint="default"/>
+        <w:sz w:val="20"/>
+      </w:rPr>
+    </w:lvl>
+  </w:abstractNum>
+  <w:num w:numId="1">
+    <w:abstractNumId w:val="0"/>
+  </w:num>
+</w:numbering>
 </file>
 
 <file path=word/styles.xml><?xml version="1.0" encoding="utf-8"?>

</xml_diff>